<commit_message>
fix: Correct OOXML structure for track changes
- Move w:del and w:ins elements to paragraph level (siblings to runs)
- Previously they were incorrectly nested inside runs, causing Word to reject the file
</commit_message>
<xml_diff>
--- a/output.docx
+++ b/output.docx
@@ -29,48 +29,69 @@
       <w:pPr>
         <w:pStyle w:val="Paragraph"/>
       </w:pPr>
-      <w:commentRangeStart w:id="0"/>
-      <w:commentRangeStart w:id="1"/>
-      <w:commentRangeStart w:id="2"/>
-      <w:commentRangeStart w:id="3"/>
-      <w:commentRangeStart w:id="4"/>
-      <w:commentRangeStart w:id="5"/>
-      <w:commentRangeStart w:id="6"/>
-      <w:commentRangeStart w:id="7"/>
       <w:r>
-        <w:t>This systematic review synthesizes existing recent knowledge on the relationship between populism and user engagement on social media. The objective is to understand how populist communication style impacts user interactions on platforms like Facebook, Twitter, Instagram, and TikTok. Employing the PRISMA methodology (Moher et al., 2009), we conducted a comprehensive search across Sage Research, Web of Science, and Scopus databases for articles and book chapters published between January 1, 2019, and January 1, 2024, using the keywords “populism,” “user engagement,” “social media,” and “populist.” Thirty-six sources met the predetermined eligibility criteria for full-text review, which were then analyzed and coded. Our findings suggest a positive association between populist content and visibility on social media, although conflicting evidence exists in the literature. Hence, populist communication style and message features tend to drive higher levels of user interactions, but variations arise due to platform affordances, user attitudes, and contextual elements (i.e., level of polarization). Additional factors, such as content subject, matter, and negativity also play significant roles. Moreover, given the relevance of social media for political communication, this research highlights the implications of populist messaging for democratic discourse, political polarization, and misinformation spread on the Internet. However, further research is still needed to explore mechanisms driving engagement with populist content, particularly on visually oriented platforms, and the influence of linguistic aspects (i.e., metaphors) on engagement levels.</w:t>
-      </w:r>
-      <w:commentRangeEnd w:id="7"/>
-      <w:r>
-        <w:commentReference w:id="7"/>
-      </w:r>
-      <w:commentRangeEnd w:id="6"/>
-      <w:r>
-        <w:commentReference w:id="6"/>
-      </w:r>
-      <w:commentRangeEnd w:id="5"/>
-      <w:r>
-        <w:commentReference w:id="5"/>
-      </w:r>
-      <w:commentRangeEnd w:id="4"/>
-      <w:r>
-        <w:commentReference w:id="4"/>
-      </w:r>
-      <w:commentRangeEnd w:id="3"/>
-      <w:r>
-        <w:commentReference w:id="3"/>
-      </w:r>
-      <w:commentRangeEnd w:id="2"/>
-      <w:r>
-        <w:commentReference w:id="2"/>
-      </w:r>
-      <w:commentRangeEnd w:id="1"/>
-      <w:r>
-        <w:commentReference w:id="1"/>
-      </w:r>
-      <w:commentRangeEnd w:id="0"/>
-      <w:r>
-        <w:commentReference w:id="0"/>
+        <w:del w:id="10256" w:author="Academic Proofreader" w:date="2026-01-17T13:52:59Z">
+          <w:r>
+            <w:delText xml:space="preserve">existing recent knowledge</w:delText>
+          </w:r>
+        </w:del>
+        <w:ins w:id="10257" w:author="Academic Proofreader" w:date="2026-01-17T13:52:59Z">
+          <w:r>
+            <w:t xml:space="preserve">recent research</w:t>
+          </w:r>
+        </w:ins>
+        <w:del w:id="61056" w:author="Academic Proofreader" w:date="2026-01-17T13:52:59Z">
+          <w:r>
+            <w:delText xml:space="preserve">The objective is to understand</w:delText>
+          </w:r>
+        </w:del>
+        <w:ins w:id="61057" w:author="Academic Proofreader" w:date="2026-01-17T13:52:59Z">
+          <w:r>
+            <w:t xml:space="preserve">This review examines</w:t>
+          </w:r>
+        </w:ins>
+        <w:del w:id="61712" w:author="Academic Proofreader" w:date="2026-01-17T13:52:59Z">
+          <w:r>
+            <w:delText xml:space="preserve">Hence,</w:delText>
+          </w:r>
+        </w:del>
+        <w:ins w:id="61713" w:author="Academic Proofreader" w:date="2026-01-17T13:52:59Z">
+          <w:r>
+            <w:t xml:space="preserve">Specifically,</w:t>
+          </w:r>
+        </w:ins>
+        <w:del w:id="62576" w:author="Academic Proofreader" w:date="2026-01-17T13:52:59Z">
+          <w:r>
+            <w:delText xml:space="preserve">content subject, matter,</w:delText>
+          </w:r>
+        </w:del>
+        <w:ins w:id="62577" w:author="Academic Proofreader" w:date="2026-01-17T13:52:59Z">
+          <w:r>
+            <w:t xml:space="preserve">subject matter</w:t>
+          </w:r>
+        </w:ins>
+        <w:del w:id="61376" w:author="Academic Proofreader" w:date="2026-01-17T13:52:59Z">
+          <w:r>
+            <w:delText xml:space="preserve">misinformation spread on the Internet.</w:delText>
+          </w:r>
+        </w:del>
+        <w:ins w:id="61377" w:author="Academic Proofreader" w:date="2026-01-17T13:52:59Z">
+          <w:r>
+            <w:t xml:space="preserve">the spread of misinformation online.</w:t>
+          </w:r>
+        </w:ins>
+        <w:t xml:space="preserve">This systematic review synthesizes  on the relationship between populism and user engagement on social media.  how populist communication style impacts user interactions on platforms like Facebook, Twitter, Instagram, and TikTok. Employing the PRISMA methodology (Moher et al., 2009), we conducted a comprehensive search across Sage Research, Web of Science, and Scopus databases for articles and book chapters published between January 1, 2019, and January 1, 2024, using the keywords “populism,” “user engagement,” “social media,” and “populist.” Thirty-six sources met the predetermined eligibility criteria for full-text review, which were then analyzed and coded. Our findings suggest a positive association between populist content and visibility on social media, although conflicting evidence exists in the literature.  populist communication style and message features tend to drive higher levels of user interactions, but variations arise due to platform affordances, user attitudes, and contextual elements (i.e., level of polarization). Additional factors, such as  and negativity also play significant roles. Moreover, given the relevance of social media for political communication, this research highlights the implications of populist messaging for democratic discourse, political polarization, and  However, </w:t>
+        <w:del w:id="62496" w:author="Academic Proofreader" w:date="2026-01-17T13:52:59Z">
+          <w:r>
+            <w:delText xml:space="preserve">further research is still needed</w:delText>
+          </w:r>
+        </w:del>
+        <w:ins w:id="62497" w:author="Academic Proofreader" w:date="2026-01-17T13:52:59Z">
+          <w:r>
+            <w:t xml:space="preserve">further research is needed</w:t>
+          </w:r>
+        </w:ins>
+        <w:t xml:space="preserve"> to explore mechanisms driving engagement with populist content, particularly on visually oriented platforms, and the influence of linguistic aspects (i.e., metaphors) on engagement levels.</w:t>
       </w:r>
     </w:p>
     <w:p>
@@ -88,75 +109,6 @@
     </w:sectPr>
   </w:body>
 </w:document>
-</file>
-
-<file path=word/comments.xml><?xml version="1.0" encoding="utf-8"?>
-<w:comments xmlns:w="http://schemas.openxmlformats.org/wordprocessingml/2006/main">
-  <w:comment w:id="0" w:author="Academic Proofreader" w:initials="AP" w:date="2026-01-15T18:16:07Z">
-    <w:p>
-      <w:r>
-        <w:t>Suggested: recent knowledge
-Redundant phrasing. 'Recent knowledge' inherently implies its existence, making 'existing' superfluous. This change improves conciseness.</w:t>
-      </w:r>
-    </w:p>
-  </w:comment>
-  <w:comment w:id="1" w:author="Academic Proofreader" w:initials="AP" w:date="2026-01-15T18:16:07Z">
-    <w:p>
-      <w:r>
-        <w:t>Suggested: platforms such as Facebook
-Replaced the colloquialism 'like' with the more formal 'such as' to maintain a consistent academic tone.</w:t>
-      </w:r>
-    </w:p>
-  </w:comment>
-  <w:comment w:id="2" w:author="Academic Proofreader" w:initials="AP" w:date="2026-01-15T18:16:07Z">
-    <w:p>
-      <w:r>
-        <w:t>Suggested: Populist communication style
-Removed the transitional adverb 'Hence,' which implies a direct logical deduction not fully supported by the preceding clause mentioning 'conflicting evidence.' This change improves logical coherence.</w:t>
-      </w:r>
-    </w:p>
-  </w:comment>
-  <w:comment w:id="3" w:author="Academic Proofreader" w:initials="AP" w:date="2026-01-15T18:16:07Z">
-    <w:p>
-      <w:r>
-        <w:t>Suggested: (e.g., level of polarization)
-Corrected the use of 'i.e.' (id est, 'that is') to 'e.g.' (exempli gratia, 'for example'). 'Level of polarization' is an example of a contextual element, not a restatement of it.</w:t>
-      </w:r>
-    </w:p>
-  </w:comment>
-  <w:comment w:id="4" w:author="Academic Proofreader" w:initials="AP" w:date="2026-01-15T18:16:07Z">
-    <w:p>
-      <w:r>
-        <w:t>Suggested: content subject matter,
-Corrected a punctuation error. 'Subject matter' is a standard compound noun and should not be separated by a comma.</w:t>
-      </w:r>
-    </w:p>
-  </w:comment>
-  <w:comment w:id="5" w:author="Academic Proofreader" w:initials="AP" w:date="2026-01-15T18:16:07Z">
-    <w:p>
-      <w:r>
-        <w:t>Suggested: the spread of misinformation
-Revised for improved conciseness and nominalization. The phrase 'the spread of misinformation' is more idiomatic. 'On the Internet' is redundant given the context of social media.</w:t>
-      </w:r>
-    </w:p>
-  </w:comment>
-  <w:comment w:id="6" w:author="Academic Proofreader" w:initials="AP" w:date="2026-01-15T18:16:07Z">
-    <w:p>
-      <w:r>
-        <w:t>Suggested: further research is needed
-Removed the redundant adverb 'still.' The phrase 'further research is needed' sufficiently conveys the point, making 'still' superfluous.</w:t>
-      </w:r>
-    </w:p>
-  </w:comment>
-  <w:comment w:id="7" w:author="Academic Proofreader" w:initials="AP" w:date="2026-01-15T18:16:07Z">
-    <w:p>
-      <w:r>
-        <w:t>Suggested: (e.g., metaphors)
-Corrected the use of 'i.e.' to 'e.g.' 'Metaphors' are provided as an example of a linguistic aspect, not as an exhaustive or clarifying definition.</w:t>
-      </w:r>
-    </w:p>
-  </w:comment>
-</w:comments>
 </file>
 
 <file path=word/styles.xml><?xml version="1.0" encoding="utf-8"?>

</xml_diff>